<commit_message>
Implement commerce module state management and routing updates
Replit-Commit-Author: Agent
</commit_message>
<xml_diff>
--- a/docs/technical.docx
+++ b/docs/technical.docx
@@ -657,6 +657,96 @@
       </w:r>
       <w:r>
         <w:t>.</w:t>
+      </w:r>
+    </w:p>
+    <w:p>
+      <w:pPr>
+        <w:pStyle w:val="Heading3"/>
+      </w:pPr>
+      <w:r>
+        <w:t>4.3 Couche de contrôle et de coordination</w:t>
+      </w:r>
+    </w:p>
+    <w:p>
+      <w:r>
+        <w:t xml:space="preserve">Le centre </w:t>
+      </w:r>
+      <w:r>
+        <w:rPr>
+          <w:b/>
+        </w:rPr>
+        <w:t>Contrôle &amp; coordination</w:t>
+      </w:r>
+      <w:r>
+        <w:t xml:space="preserve"> est accessible depuis MAXIMUS et depuis les espaces entreprise :</w:t>
+      </w:r>
+    </w:p>
+    <w:p>
+      <w:pPr>
+        <w:pStyle w:val="ListBullet"/>
+        <w:spacing w:after="40"/>
+      </w:pPr>
+      <w:r>
+        <w:t>/maximus/controle : vue transverse pour l’administration MAXIMUS ;</w:t>
+      </w:r>
+    </w:p>
+    <w:p>
+      <w:pPr>
+        <w:pStyle w:val="ListBullet"/>
+        <w:spacing w:after="40"/>
+      </w:pPr>
+      <w:r>
+        <w:t>/kora/controle : vue limitée au périmètre de l’entreprise, de l’unité ou de l’employé.</w:t>
+      </w:r>
+    </w:p>
+    <w:p>
+      <w:r>
+        <w:t>Le store conserve trois flux complémentaires :</w:t>
+      </w:r>
+    </w:p>
+    <w:p>
+      <w:pPr>
+        <w:pStyle w:val="ListBullet"/>
+        <w:spacing w:after="40"/>
+      </w:pPr>
+      <w:r>
+        <w:t>controlTasks : actions, validations et décisions attendues ;</w:t>
+      </w:r>
+    </w:p>
+    <w:p>
+      <w:pPr>
+        <w:pStyle w:val="ListBullet"/>
+        <w:spacing w:after="40"/>
+      </w:pPr>
+      <w:r>
+        <w:t>domainEvents : événements métier produits par une opération ;</w:t>
+      </w:r>
+    </w:p>
+    <w:p>
+      <w:pPr>
+        <w:pStyle w:val="ListBullet"/>
+        <w:spacing w:after="40"/>
+      </w:pPr>
+      <w:r>
+        <w:t>auditEntries : journal attribué des changements et validations.</w:t>
+      </w:r>
+    </w:p>
+    <w:p>
+      <w:r>
+        <w:t>Une validation de tâche met à jour son statut et écrit simultanément un événement, une trace d’audit et une notification. Cette chaîne constitue le premier socle d’un futur moteur de workflows :</w:t>
+      </w:r>
+    </w:p>
+    <w:p>
+      <w:pPr>
+        <w:pStyle w:val="MAXIMUSCode"/>
+      </w:pPr>
+      <w:r>
+        <w:t>Événement → tâche → approbation → mise à jour → audit → notification</w:t>
+      </w:r>
+    </w:p>
+    <w:p>
+      <w:r>
+        <w:t>Les tâches sont filtrées par entreprise. Un employé voit les tâches qui lui sont affectées ; un administrateur d’entreprise ou un manager de secteur voit le périmètre qui lui est confié.</w:t>
       </w:r>
     </w:p>
     <w:p>

</xml_diff>